<commit_message>
Add GitHub Actions tab screenshot and update submission document
</commit_message>
<xml_diff>
--- a/web-dev-lab-submission.docx
+++ b/web-dev-lab-submission.docx
@@ -1214,6 +1214,61 @@
     </w:p>
     <w:p>
       <w:pPr>
+        <w:spacing w:before="200" w:after="80"/>
+        <w:jc w:val="center"/>
+      </w:pPr>
+      <w:r>
+        <w:drawing>
+          <wp:inline xmlns:a="http://schemas.openxmlformats.org/drawingml/2006/main" xmlns:pic="http://schemas.openxmlformats.org/drawingml/2006/picture">
+            <wp:extent cx="5120640" cy="2450973"/>
+            <wp:docPr id="6" name="Picture 6"/>
+            <wp:cNvGraphicFramePr>
+              <a:graphicFrameLocks noChangeAspect="1"/>
+            </wp:cNvGraphicFramePr>
+            <a:graphic>
+              <a:graphicData uri="http://schemas.openxmlformats.org/drawingml/2006/picture">
+                <pic:pic>
+                  <pic:nvPicPr>
+                    <pic:cNvPr id="0" name="github_actions_tab_1792434212918.png"/>
+                    <pic:cNvPicPr/>
+                  </pic:nvPicPr>
+                  <pic:blipFill>
+                    <a:blip r:embed="rId14"/>
+                    <a:stretch>
+                      <a:fillRect/>
+                    </a:stretch>
+                  </pic:blipFill>
+                  <pic:spPr>
+                    <a:xfrm>
+                      <a:off x="0" y="0"/>
+                      <a:ext cx="5120640" cy="2450973"/>
+                    </a:xfrm>
+                    <a:prstGeom prst="rect"/>
+                  </pic:spPr>
+                </pic:pic>
+              </a:graphicData>
+            </a:graphic>
+          </wp:inline>
+        </w:drawing>
+      </w:r>
+    </w:p>
+    <w:p>
+      <w:pPr>
+        <w:spacing w:after="320"/>
+        <w:jc w:val="center"/>
+      </w:pPr>
+      <w:r>
+        <w:rPr>
+          <w:rFonts w:ascii="TH Sarabun New" w:hAnsi="TH Sarabun New"/>
+          <w:i/>
+          <w:color w:val="64748B"/>
+          <w:sz w:val="24"/>
+        </w:rPr>
+        <w:t>ภาพที่ 6: แท็บ GitHub Actions บน Repository จริง แสดงประวัติการรัน Workflow</w:t>
+      </w:r>
+    </w:p>
+    <w:p>
+      <w:pPr>
         <w:pStyle w:val="Heading1"/>
       </w:pPr>
       <w:r>

</xml_diff>